<commit_message>
Actualizar evidencia de publicación
</commit_message>
<xml_diff>
--- a/outputs/Documentacion_Proyecto_Cifrados_Clasicos.docx
+++ b/outputs/Documentacion_Proyecto_Cifrados_Clasicos.docx
@@ -7104,7 +7104,7 @@
           <w:color w:val="202124"/>
           <w:sz w:val="22"/>
         </w:rPr>
-        <w:t>La publicación HTTPS se verifica después de que el flujo termine correctamente.</w:t>
+        <w:t>Se verificó que la publicación HTTPS abre sin iniciar sesión y que carga la interfaz completa.</w:t>
       </w:r>
     </w:p>
     <w:p>
@@ -7200,7 +7200,7 @@
                 <w:color w:val="202124"/>
                 <w:sz w:val="18"/>
               </w:rPr>
-              <w:t>Valor real que debe incorporarse</w:t>
+              <w:t>Valor verificado</w:t>
             </w:r>
           </w:p>
         </w:tc>
@@ -7575,7 +7575,7 @@
                 <w:color w:val="202124"/>
                 <w:sz w:val="18"/>
               </w:rPr>
-              <w:t>Programada al finalizar el primer despliegue</w:t>
+              <w:t>URL verificada sin iniciar sesión; diseño adaptable incluido</w:t>
             </w:r>
           </w:p>
         </w:tc>
@@ -9995,10 +9995,10 @@
         </w:tblBorders>
       </w:tblPr>
       <w:tblGrid>
-        <w:gridCol w:w="2628"/>
-        <w:gridCol w:w="1284"/>
-        <w:gridCol w:w="2436"/>
-        <w:gridCol w:w="3012"/>
+        <w:gridCol w:w="2470"/>
+        <w:gridCol w:w="1249"/>
+        <w:gridCol w:w="2296"/>
+        <w:gridCol w:w="3345"/>
       </w:tblGrid>
       <w:tr>
         <w:trPr>
@@ -10006,7 +10006,7 @@
         </w:trPr>
         <w:tc>
           <w:tcPr>
-            <w:tcW w:type="dxa" w:w="2628"/>
+            <w:tcW w:type="dxa" w:w="2470"/>
             <w:tcMar>
               <w:top w:w="80" w:type="dxa"/>
               <w:start w:w="120" w:type="dxa"/>
@@ -10035,7 +10035,7 @@
         </w:tc>
         <w:tc>
           <w:tcPr>
-            <w:tcW w:type="dxa" w:w="1284"/>
+            <w:tcW w:type="dxa" w:w="1249"/>
             <w:tcMar>
               <w:top w:w="80" w:type="dxa"/>
               <w:start w:w="120" w:type="dxa"/>
@@ -10064,7 +10064,7 @@
         </w:tc>
         <w:tc>
           <w:tcPr>
-            <w:tcW w:type="dxa" w:w="2436"/>
+            <w:tcW w:type="dxa" w:w="2296"/>
             <w:tcMar>
               <w:top w:w="80" w:type="dxa"/>
               <w:start w:w="120" w:type="dxa"/>
@@ -10093,7 +10093,7 @@
         </w:tc>
         <w:tc>
           <w:tcPr>
-            <w:tcW w:type="dxa" w:w="3012"/>
+            <w:tcW w:type="dxa" w:w="3345"/>
             <w:tcMar>
               <w:top w:w="80" w:type="dxa"/>
               <w:start w:w="120" w:type="dxa"/>
@@ -10124,7 +10124,7 @@
       <w:tr>
         <w:tc>
           <w:tcPr>
-            <w:tcW w:type="dxa" w:w="2628"/>
+            <w:tcW w:type="dxa" w:w="2470"/>
             <w:tcMar>
               <w:top w:w="80" w:type="dxa"/>
               <w:start w:w="120" w:type="dxa"/>
@@ -10152,7 +10152,7 @@
         </w:tc>
         <w:tc>
           <w:tcPr>
-            <w:tcW w:type="dxa" w:w="1284"/>
+            <w:tcW w:type="dxa" w:w="1249"/>
             <w:tcMar>
               <w:top w:w="80" w:type="dxa"/>
               <w:start w:w="120" w:type="dxa"/>
@@ -10180,7 +10180,7 @@
         </w:tc>
         <w:tc>
           <w:tcPr>
-            <w:tcW w:type="dxa" w:w="2436"/>
+            <w:tcW w:type="dxa" w:w="2296"/>
             <w:tcMar>
               <w:top w:w="80" w:type="dxa"/>
               <w:start w:w="120" w:type="dxa"/>
@@ -10208,7 +10208,7 @@
         </w:tc>
         <w:tc>
           <w:tcPr>
-            <w:tcW w:type="dxa" w:w="3012"/>
+            <w:tcW w:type="dxa" w:w="3345"/>
             <w:tcMar>
               <w:top w:w="80" w:type="dxa"/>
               <w:start w:w="120" w:type="dxa"/>
@@ -10230,7 +10230,7 @@
                 <w:color w:val="202124"/>
                 <w:sz w:val="18"/>
               </w:rPr>
-              <w:t>Plantilla; faltan datos académicos y ligas</w:t>
+              <w:t>Ligas incluidas; faltan sólo los datos académicos del estudiante</w:t>
             </w:r>
           </w:p>
         </w:tc>
@@ -10238,7 +10238,7 @@
       <w:tr>
         <w:tc>
           <w:tcPr>
-            <w:tcW w:type="dxa" w:w="2628"/>
+            <w:tcW w:type="dxa" w:w="2470"/>
             <w:tcMar>
               <w:top w:w="80" w:type="dxa"/>
               <w:start w:w="120" w:type="dxa"/>
@@ -10266,7 +10266,7 @@
         </w:tc>
         <w:tc>
           <w:tcPr>
-            <w:tcW w:type="dxa" w:w="1284"/>
+            <w:tcW w:type="dxa" w:w="1249"/>
             <w:tcMar>
               <w:top w:w="80" w:type="dxa"/>
               <w:start w:w="120" w:type="dxa"/>
@@ -10294,7 +10294,7 @@
         </w:tc>
         <w:tc>
           <w:tcPr>
-            <w:tcW w:type="dxa" w:w="2436"/>
+            <w:tcW w:type="dxa" w:w="2296"/>
             <w:tcMar>
               <w:top w:w="80" w:type="dxa"/>
               <w:start w:w="120" w:type="dxa"/>
@@ -10322,7 +10322,7 @@
         </w:tc>
         <w:tc>
           <w:tcPr>
-            <w:tcW w:type="dxa" w:w="3012"/>
+            <w:tcW w:type="dxa" w:w="3345"/>
             <w:tcMar>
               <w:top w:w="80" w:type="dxa"/>
               <w:start w:w="120" w:type="dxa"/>
@@ -10352,7 +10352,7 @@
       <w:tr>
         <w:tc>
           <w:tcPr>
-            <w:tcW w:type="dxa" w:w="2628"/>
+            <w:tcW w:type="dxa" w:w="2470"/>
             <w:tcMar>
               <w:top w:w="80" w:type="dxa"/>
               <w:start w:w="120" w:type="dxa"/>
@@ -10380,7 +10380,7 @@
         </w:tc>
         <w:tc>
           <w:tcPr>
-            <w:tcW w:type="dxa" w:w="1284"/>
+            <w:tcW w:type="dxa" w:w="1249"/>
             <w:tcMar>
               <w:top w:w="80" w:type="dxa"/>
               <w:start w:w="120" w:type="dxa"/>
@@ -10408,7 +10408,7 @@
         </w:tc>
         <w:tc>
           <w:tcPr>
-            <w:tcW w:type="dxa" w:w="2436"/>
+            <w:tcW w:type="dxa" w:w="2296"/>
             <w:tcMar>
               <w:top w:w="80" w:type="dxa"/>
               <w:start w:w="120" w:type="dxa"/>
@@ -10436,7 +10436,7 @@
         </w:tc>
         <w:tc>
           <w:tcPr>
-            <w:tcW w:type="dxa" w:w="3012"/>
+            <w:tcW w:type="dxa" w:w="3345"/>
             <w:tcMar>
               <w:top w:w="80" w:type="dxa"/>
               <w:start w:w="120" w:type="dxa"/>
@@ -10466,7 +10466,7 @@
       <w:tr>
         <w:tc>
           <w:tcPr>
-            <w:tcW w:type="dxa" w:w="2628"/>
+            <w:tcW w:type="dxa" w:w="2470"/>
             <w:tcMar>
               <w:top w:w="80" w:type="dxa"/>
               <w:start w:w="120" w:type="dxa"/>
@@ -10494,7 +10494,7 @@
         </w:tc>
         <w:tc>
           <w:tcPr>
-            <w:tcW w:type="dxa" w:w="1284"/>
+            <w:tcW w:type="dxa" w:w="1249"/>
             <w:tcMar>
               <w:top w:w="80" w:type="dxa"/>
               <w:start w:w="120" w:type="dxa"/>
@@ -10522,7 +10522,7 @@
         </w:tc>
         <w:tc>
           <w:tcPr>
-            <w:tcW w:type="dxa" w:w="2436"/>
+            <w:tcW w:type="dxa" w:w="2296"/>
             <w:tcMar>
               <w:top w:w="80" w:type="dxa"/>
               <w:start w:w="120" w:type="dxa"/>
@@ -10550,7 +10550,7 @@
         </w:tc>
         <w:tc>
           <w:tcPr>
-            <w:tcW w:type="dxa" w:w="3012"/>
+            <w:tcW w:type="dxa" w:w="3345"/>
             <w:tcMar>
               <w:top w:w="80" w:type="dxa"/>
               <w:start w:w="120" w:type="dxa"/>
@@ -10580,7 +10580,7 @@
       <w:tr>
         <w:tc>
           <w:tcPr>
-            <w:tcW w:type="dxa" w:w="2628"/>
+            <w:tcW w:type="dxa" w:w="2470"/>
             <w:tcMar>
               <w:top w:w="80" w:type="dxa"/>
               <w:start w:w="120" w:type="dxa"/>
@@ -10608,7 +10608,7 @@
         </w:tc>
         <w:tc>
           <w:tcPr>
-            <w:tcW w:type="dxa" w:w="1284"/>
+            <w:tcW w:type="dxa" w:w="1249"/>
             <w:tcMar>
               <w:top w:w="80" w:type="dxa"/>
               <w:start w:w="120" w:type="dxa"/>
@@ -10636,7 +10636,7 @@
         </w:tc>
         <w:tc>
           <w:tcPr>
-            <w:tcW w:type="dxa" w:w="2436"/>
+            <w:tcW w:type="dxa" w:w="2296"/>
             <w:tcMar>
               <w:top w:w="80" w:type="dxa"/>
               <w:start w:w="120" w:type="dxa"/>
@@ -10664,7 +10664,7 @@
         </w:tc>
         <w:tc>
           <w:tcPr>
-            <w:tcW w:type="dxa" w:w="3012"/>
+            <w:tcW w:type="dxa" w:w="3345"/>
             <w:tcMar>
               <w:top w:w="80" w:type="dxa"/>
               <w:start w:w="120" w:type="dxa"/>
@@ -10686,7 +10686,17 @@
                 <w:color w:val="202124"/>
                 <w:sz w:val="18"/>
               </w:rPr>
-              <w:t>Implementado localmente; falta commit público</w:t>
+              <w:t xml:space="preserve">Implementada y enlazada a la etiqueta pública </w:t>
+            </w:r>
+            <w:r>
+              <w:rPr>
+                <w:rFonts w:ascii="Consolas" w:hAnsi="Consolas" w:eastAsia="Consolas" w:cs="Consolas"/>
+                <w:b w:val="0"/>
+                <w:color w:val="1F4D78"/>
+                <w:sz w:val="17"/>
+                <w:shd w:fill="EEF2F6"/>
+              </w:rPr>
+              <w:t>v1.0.0</w:t>
             </w:r>
           </w:p>
         </w:tc>
@@ -10694,7 +10704,7 @@
       <w:tr>
         <w:tc>
           <w:tcPr>
-            <w:tcW w:type="dxa" w:w="2628"/>
+            <w:tcW w:type="dxa" w:w="2470"/>
             <w:tcMar>
               <w:top w:w="80" w:type="dxa"/>
               <w:start w:w="120" w:type="dxa"/>
@@ -10722,7 +10732,7 @@
         </w:tc>
         <w:tc>
           <w:tcPr>
-            <w:tcW w:type="dxa" w:w="1284"/>
+            <w:tcW w:type="dxa" w:w="1249"/>
             <w:tcMar>
               <w:top w:w="80" w:type="dxa"/>
               <w:start w:w="120" w:type="dxa"/>
@@ -10750,7 +10760,7 @@
         </w:tc>
         <w:tc>
           <w:tcPr>
-            <w:tcW w:type="dxa" w:w="2436"/>
+            <w:tcW w:type="dxa" w:w="2296"/>
             <w:tcMar>
               <w:top w:w="80" w:type="dxa"/>
               <w:start w:w="120" w:type="dxa"/>
@@ -10778,7 +10788,7 @@
         </w:tc>
         <w:tc>
           <w:tcPr>
-            <w:tcW w:type="dxa" w:w="3012"/>
+            <w:tcW w:type="dxa" w:w="3345"/>
             <w:tcMar>
               <w:top w:w="80" w:type="dxa"/>
               <w:start w:w="120" w:type="dxa"/>
@@ -10808,7 +10818,7 @@
       <w:tr>
         <w:tc>
           <w:tcPr>
-            <w:tcW w:type="dxa" w:w="2628"/>
+            <w:tcW w:type="dxa" w:w="2470"/>
             <w:tcMar>
               <w:top w:w="80" w:type="dxa"/>
               <w:start w:w="120" w:type="dxa"/>
@@ -10836,7 +10846,7 @@
         </w:tc>
         <w:tc>
           <w:tcPr>
-            <w:tcW w:type="dxa" w:w="1284"/>
+            <w:tcW w:type="dxa" w:w="1249"/>
             <w:tcMar>
               <w:top w:w="80" w:type="dxa"/>
               <w:start w:w="120" w:type="dxa"/>
@@ -10864,7 +10874,7 @@
         </w:tc>
         <w:tc>
           <w:tcPr>
-            <w:tcW w:type="dxa" w:w="2436"/>
+            <w:tcW w:type="dxa" w:w="2296"/>
             <w:tcMar>
               <w:top w:w="80" w:type="dxa"/>
               <w:start w:w="120" w:type="dxa"/>
@@ -10892,7 +10902,7 @@
         </w:tc>
         <w:tc>
           <w:tcPr>
-            <w:tcW w:type="dxa" w:w="3012"/>
+            <w:tcW w:type="dxa" w:w="3345"/>
             <w:tcMar>
               <w:top w:w="80" w:type="dxa"/>
               <w:start w:w="120" w:type="dxa"/>
@@ -10922,7 +10932,7 @@
       <w:tr>
         <w:tc>
           <w:tcPr>
-            <w:tcW w:type="dxa" w:w="2628"/>
+            <w:tcW w:type="dxa" w:w="2470"/>
             <w:tcMar>
               <w:top w:w="80" w:type="dxa"/>
               <w:start w:w="120" w:type="dxa"/>
@@ -10950,7 +10960,7 @@
         </w:tc>
         <w:tc>
           <w:tcPr>
-            <w:tcW w:type="dxa" w:w="1284"/>
+            <w:tcW w:type="dxa" w:w="1249"/>
             <w:tcMar>
               <w:top w:w="80" w:type="dxa"/>
               <w:start w:w="120" w:type="dxa"/>
@@ -10978,7 +10988,7 @@
         </w:tc>
         <w:tc>
           <w:tcPr>
-            <w:tcW w:type="dxa" w:w="2436"/>
+            <w:tcW w:type="dxa" w:w="2296"/>
             <w:tcMar>
               <w:top w:w="80" w:type="dxa"/>
               <w:start w:w="120" w:type="dxa"/>
@@ -11006,7 +11016,7 @@
         </w:tc>
         <w:tc>
           <w:tcPr>
-            <w:tcW w:type="dxa" w:w="3012"/>
+            <w:tcW w:type="dxa" w:w="3345"/>
             <w:tcMar>
               <w:top w:w="80" w:type="dxa"/>
               <w:start w:w="120" w:type="dxa"/>
@@ -11036,7 +11046,7 @@
       <w:tr>
         <w:tc>
           <w:tcPr>
-            <w:tcW w:type="dxa" w:w="2628"/>
+            <w:tcW w:type="dxa" w:w="2470"/>
             <w:tcMar>
               <w:top w:w="80" w:type="dxa"/>
               <w:start w:w="120" w:type="dxa"/>
@@ -11064,7 +11074,7 @@
         </w:tc>
         <w:tc>
           <w:tcPr>
-            <w:tcW w:type="dxa" w:w="1284"/>
+            <w:tcW w:type="dxa" w:w="1249"/>
             <w:tcMar>
               <w:top w:w="80" w:type="dxa"/>
               <w:start w:w="120" w:type="dxa"/>
@@ -11092,7 +11102,7 @@
         </w:tc>
         <w:tc>
           <w:tcPr>
-            <w:tcW w:type="dxa" w:w="2436"/>
+            <w:tcW w:type="dxa" w:w="2296"/>
             <w:tcMar>
               <w:top w:w="80" w:type="dxa"/>
               <w:start w:w="120" w:type="dxa"/>
@@ -11120,7 +11130,7 @@
         </w:tc>
         <w:tc>
           <w:tcPr>
-            <w:tcW w:type="dxa" w:w="3012"/>
+            <w:tcW w:type="dxa" w:w="3345"/>
             <w:tcMar>
               <w:top w:w="80" w:type="dxa"/>
               <w:start w:w="120" w:type="dxa"/>
@@ -11150,7 +11160,7 @@
       <w:tr>
         <w:tc>
           <w:tcPr>
-            <w:tcW w:type="dxa" w:w="2628"/>
+            <w:tcW w:type="dxa" w:w="2470"/>
             <w:tcMar>
               <w:top w:w="80" w:type="dxa"/>
               <w:start w:w="120" w:type="dxa"/>
@@ -11178,7 +11188,7 @@
         </w:tc>
         <w:tc>
           <w:tcPr>
-            <w:tcW w:type="dxa" w:w="1284"/>
+            <w:tcW w:type="dxa" w:w="1249"/>
             <w:tcMar>
               <w:top w:w="80" w:type="dxa"/>
               <w:start w:w="120" w:type="dxa"/>
@@ -11206,7 +11216,7 @@
         </w:tc>
         <w:tc>
           <w:tcPr>
-            <w:tcW w:type="dxa" w:w="2436"/>
+            <w:tcW w:type="dxa" w:w="2296"/>
             <w:tcMar>
               <w:top w:w="80" w:type="dxa"/>
               <w:start w:w="120" w:type="dxa"/>
@@ -11234,7 +11244,7 @@
         </w:tc>
         <w:tc>
           <w:tcPr>
-            <w:tcW w:type="dxa" w:w="3012"/>
+            <w:tcW w:type="dxa" w:w="3345"/>
             <w:tcMar>
               <w:top w:w="80" w:type="dxa"/>
               <w:start w:w="120" w:type="dxa"/>
@@ -11264,7 +11274,7 @@
       <w:tr>
         <w:tc>
           <w:tcPr>
-            <w:tcW w:type="dxa" w:w="2628"/>
+            <w:tcW w:type="dxa" w:w="2470"/>
             <w:tcMar>
               <w:top w:w="80" w:type="dxa"/>
               <w:start w:w="120" w:type="dxa"/>
@@ -11292,7 +11302,7 @@
         </w:tc>
         <w:tc>
           <w:tcPr>
-            <w:tcW w:type="dxa" w:w="1284"/>
+            <w:tcW w:type="dxa" w:w="1249"/>
             <w:tcMar>
               <w:top w:w="80" w:type="dxa"/>
               <w:start w:w="120" w:type="dxa"/>
@@ -11320,7 +11330,7 @@
         </w:tc>
         <w:tc>
           <w:tcPr>
-            <w:tcW w:type="dxa" w:w="2436"/>
+            <w:tcW w:type="dxa" w:w="2296"/>
             <w:tcMar>
               <w:top w:w="80" w:type="dxa"/>
               <w:start w:w="120" w:type="dxa"/>
@@ -11348,7 +11358,7 @@
         </w:tc>
         <w:tc>
           <w:tcPr>
-            <w:tcW w:type="dxa" w:w="3012"/>
+            <w:tcW w:type="dxa" w:w="3345"/>
             <w:tcMar>
               <w:top w:w="80" w:type="dxa"/>
               <w:start w:w="120" w:type="dxa"/>
@@ -11378,7 +11388,7 @@
       <w:tr>
         <w:tc>
           <w:tcPr>
-            <w:tcW w:type="dxa" w:w="2628"/>
+            <w:tcW w:type="dxa" w:w="2470"/>
             <w:tcMar>
               <w:top w:w="80" w:type="dxa"/>
               <w:start w:w="120" w:type="dxa"/>
@@ -11406,7 +11416,7 @@
         </w:tc>
         <w:tc>
           <w:tcPr>
-            <w:tcW w:type="dxa" w:w="1284"/>
+            <w:tcW w:type="dxa" w:w="1249"/>
             <w:tcMar>
               <w:top w:w="80" w:type="dxa"/>
               <w:start w:w="120" w:type="dxa"/>
@@ -11434,7 +11444,7 @@
         </w:tc>
         <w:tc>
           <w:tcPr>
-            <w:tcW w:type="dxa" w:w="2436"/>
+            <w:tcW w:type="dxa" w:w="2296"/>
             <w:tcMar>
               <w:top w:w="80" w:type="dxa"/>
               <w:start w:w="120" w:type="dxa"/>
@@ -11462,7 +11472,7 @@
         </w:tc>
         <w:tc>
           <w:tcPr>
-            <w:tcW w:type="dxa" w:w="3012"/>
+            <w:tcW w:type="dxa" w:w="3345"/>
             <w:tcMar>
               <w:top w:w="80" w:type="dxa"/>
               <w:start w:w="120" w:type="dxa"/>

</xml_diff>